<commit_message>
Add Well Met to both resumes
Adds Well Met (Aug 2026 - present) as the top role in the main and
contract resumes, with React Native, WebSockets, GitHub Actions and
agentic development added to skills. Trims older bullets and merges the
open source and speaking lines into the education section so both
versions still fit on one page.

Co-Authored-By: Claude Opus 5.5 (1M context) <noreply@anthropic.com>
Claude-Session: https://claude.ai/code/session_01Sg1kiszoqyzBLJGHQMwxGq
</commit_message>
<xml_diff>
--- a/Harrison-Pielke-Lombardo-Resume-Contract.docx
+++ b/Harrison-Pielke-Lombardo-Resume-Contract.docx
@@ -68,7 +68,7 @@
           <w:b w:val="0"/>
           <w:i w:val="0"/>
         </w:rPr>
-        <w:t>Senior backend and full-stack engineer available for contract and 1099 engagements, remote or on-site in Colorado. 10 years of building production systems in Python, Clojure, TypeScript, and Java. Most recently built the document-processing pipeline, rules engine, and AWS infrastructure behind a B2B SaaS logistics platform handling 1M+ documents per month, which grew from zero to $2.1M ARR and was acquired. Comfortable owning a project end to end, working directly with clients, and getting productive quickly in an existing codebase.</w:t>
+        <w:t>Senior backend and full-stack engineer available for contract and 1099 engagements, remote or on-site in Colorado. 10 years of building production systems in Python, Clojure, TypeScript, and Java. Built the pipeline, rules engine, and AWS infrastructure behind a B2B SaaS platform handling 1M+ documents per month, from zero to $2.1M ARR through acquisition. Now building Well Met, a web and mobile app, with AI coding agents. Owns projects end to end and works directly with clients.</w:t>
       </w:r>
     </w:p>
     <w:p>
@@ -180,7 +180,7 @@
           <w:b w:val="0"/>
           <w:i w:val="0"/>
         </w:rPr>
-        <w:t>new builds, maintenance, and modernization of existing Clojure systems</w:t>
+        <w:t>new builds, web and mobile apps, and modernizing existing systems</w:t>
       </w:r>
     </w:p>
     <w:p>
@@ -228,14 +228,14 @@
           <w:b/>
           <w:i w:val="0"/>
         </w:rPr>
-        <w:t xml:space="preserve">Frontend: </w:t>
+        <w:t xml:space="preserve">Frontend &amp; Mobile: </w:t>
       </w:r>
       <w:r>
         <w:rPr>
           <w:b w:val="0"/>
           <w:i w:val="0"/>
         </w:rPr>
-        <w:t>TypeScript, ClojureScript, React (Reagent / re-frame), JavaScript, data visualization</w:t>
+        <w:t>TypeScript, ClojureScript, React (Reagent / re-frame), React Native (Expo), JavaScript, WebSockets</w:t>
       </w:r>
     </w:p>
     <w:p>
@@ -273,7 +273,7 @@
           <w:b w:val="0"/>
           <w:i w:val="0"/>
         </w:rPr>
-        <w:t>AWS (Lambda, ECS, EC2, SQS, SNS, RDS, DynamoDB, CloudFront), Terraform, Docker, CI/CD, Git, GitHub</w:t>
+        <w:t>AWS (Lambda, ECS, EC2, SQS, SNS, RDS, DynamoDB, CloudFront), Terraform, Docker, GitHub Actions, CI/CD</w:t>
       </w:r>
     </w:p>
     <w:p>
@@ -292,7 +292,7 @@
           <w:b w:val="0"/>
           <w:i w:val="0"/>
         </w:rPr>
-        <w:t>LLM integration, PyTorch, NLP, AI-assisted development (Claude, Copilot)</w:t>
+        <w:t>LLM integration, PyTorch, NLP, agentic development with Claude Code</w:t>
       </w:r>
     </w:p>
     <w:p>
@@ -315,6 +315,116 @@
     <w:p>
       <w:pPr>
         <w:spacing w:before="0" w:after="0"/>
+      </w:pPr>
+      <w:r>
+        <w:rPr>
+          <w:b/>
+          <w:i w:val="0"/>
+        </w:rPr>
+        <w:t>Founder &amp; Software Engineer</w:t>
+      </w:r>
+      <w:r>
+        <w:rPr>
+          <w:b w:val="0"/>
+          <w:i w:val="0"/>
+        </w:rPr>
+        <w:t xml:space="preserve">  |  Aug 2026 - Present</w:t>
+      </w:r>
+    </w:p>
+    <w:p>
+      <w:pPr>
+        <w:spacing w:before="0" w:after="0"/>
+      </w:pPr>
+      <w:r>
+        <w:rPr>
+          <w:b w:val="0"/>
+          <w:i/>
+        </w:rPr>
+        <w:t>Well Met (pre-launch dating app, getwellmet.app)</w:t>
+      </w:r>
+      <w:r>
+        <w:rPr>
+          <w:b w:val="0"/>
+          <w:i/>
+        </w:rPr>
+        <w:t>, Denver, CO</w:t>
+      </w:r>
+    </w:p>
+    <w:p>
+      <w:pPr>
+        <w:tabs>
+          <w:tab w:pos="259" w:val="left"/>
+        </w:tabs>
+        <w:spacing w:before="0" w:after="20"/>
+        <w:ind w:left="259" w:hanging="187"/>
+      </w:pPr>
+      <w:r>
+        <w:rPr>
+          <w:b w:val="0"/>
+          <w:i w:val="0"/>
+        </w:rPr>
+        <w:t>•</w:t>
+        <w:tab/>
+        <w:t>Building a web, iOS, and Android dating app centered on structured, mutual-consent post-date reviews.</w:t>
+      </w:r>
+    </w:p>
+    <w:p>
+      <w:pPr>
+        <w:tabs>
+          <w:tab w:pos="259" w:val="left"/>
+        </w:tabs>
+        <w:spacing w:before="0" w:after="20"/>
+        <w:ind w:left="259" w:hanging="187"/>
+      </w:pPr>
+      <w:r>
+        <w:rPr>
+          <w:b w:val="0"/>
+          <w:i w:val="0"/>
+        </w:rPr>
+        <w:t>•</w:t>
+        <w:tab/>
+        <w:t>Architected a Clojure backend on PostgreSQL with real-time WebSocket updates, and one shared ClojureScript / re-frame core for the web app, admin tool, and React Native (Expo) mobile app.</w:t>
+      </w:r>
+    </w:p>
+    <w:p>
+      <w:pPr>
+        <w:tabs>
+          <w:tab w:pos="259" w:val="left"/>
+        </w:tabs>
+        <w:spacing w:before="0" w:after="20"/>
+        <w:ind w:left="259" w:hanging="187"/>
+      </w:pPr>
+      <w:r>
+        <w:rPr>
+          <w:b w:val="0"/>
+          <w:i w:val="0"/>
+        </w:rPr>
+        <w:t>•</w:t>
+        <w:tab/>
+        <w:t>Implemented ID verification (Persona), geohash-only location storage, and audit-logged photo and video moderation.</w:t>
+      </w:r>
+    </w:p>
+    <w:p>
+      <w:pPr>
+        <w:tabs>
+          <w:tab w:pos="259" w:val="left"/>
+        </w:tabs>
+        <w:spacing w:before="0" w:after="20"/>
+        <w:ind w:left="259" w:hanging="187"/>
+      </w:pPr>
+      <w:r>
+        <w:rPr>
+          <w:b w:val="0"/>
+          <w:i w:val="0"/>
+        </w:rPr>
+        <w:t>•</w:t>
+        <w:tab/>
+        <w:t>Led development with AI coding agents (Claude Code) under written architecture guardrails and review, merging 450+ pull requests in two months with Playwright, unit, and CI test suites.</w:t>
+      </w:r>
+    </w:p>
+    <w:p>
+      <w:pPr>
+        <w:spacing w:before="80" w:after="0"/>
       </w:pPr>
       <w:r>
         <w:rPr>
@@ -365,7 +475,7 @@
         </w:rPr>
         <w:t>•</w:t>
         <w:tab/>
-        <w:t>Helped scale a B2B SaaS logistics platform from zero to $2.1M ARR and 70+ business customers as part of a 4-6 person engineering team, leading to the company's acquisition.</w:t>
+        <w:t>Helped scale a B2B SaaS logistics platform from zero to $2.1M ARR and 70+ customers on a 4-6 person team through acquisition.</w:t>
       </w:r>
     </w:p>
     <w:p>
@@ -383,7 +493,7 @@
         </w:rPr>
         <w:t>•</w:t>
         <w:tab/>
-        <w:t>Designed and built the core load processing pipeline and a custom rules engine in Clojure and Python, processing 1M+ documents per month through REST and GraphQL APIs.</w:t>
+        <w:t>Designed and built the core load processing pipeline and rules engine in Clojure and Python, handling 1M+ documents per month via REST and GraphQL.</w:t>
       </w:r>
     </w:p>
     <w:p>
@@ -419,7 +529,7 @@
         </w:rPr>
         <w:t>•</w:t>
         <w:tab/>
-        <w:t>Planned and executed the zero-downtime migration of the production database from Datomic to PostgreSQL as it approached Datomic's size limits.</w:t>
+        <w:t>Led a zero-downtime migration of the production database from Datomic to PostgreSQL as it neared Datomic's size limits.</w:t>
       </w:r>
     </w:p>
     <w:p>
@@ -511,7 +621,7 @@
         </w:rPr>
         <w:t>•</w:t>
         <w:tab/>
-        <w:t>Led software for interconnected research projects across 4+ cross-functional teams, shipping 5 open-source package releases, 4 dataset releases, and 6 peer-reviewed publications.</w:t>
+        <w:t>Led software for research projects across 4+ teams, shipping 5 open-source packages, 4 datasets, and 6 publications.</w:t>
       </w:r>
     </w:p>
     <w:p>
@@ -529,25 +639,7 @@
         </w:rPr>
         <w:t>•</w:t>
         <w:tab/>
-        <w:t>Built Knowtator, a Java and ClojureScript / re-frame web app for text annotation and ontology development (rewritten from a Java Swing desktop app), used to create 100k+ annotations by clinicians and researchers.</w:t>
-      </w:r>
-    </w:p>
-    <w:p>
-      <w:pPr>
-        <w:tabs>
-          <w:tab w:pos="259" w:val="left"/>
-        </w:tabs>
-        <w:spacing w:before="0" w:after="20"/>
-        <w:ind w:left="259" w:hanging="187"/>
-      </w:pPr>
-      <w:r>
-        <w:rPr>
-          <w:b w:val="0"/>
-          <w:i w:val="0"/>
-        </w:rPr>
-        <w:t>•</w:t>
-        <w:tab/>
-        <w:t>Improved relation-extraction precision by 10% with a novel bootstrapping algorithm accelerated with GPU matrix operations.</w:t>
+        <w:t>Built Knowtator, a Java and ClojureScript / re-frame annotation web app (rewritten from Java Swing), used for 100k+ annotations by clinicians and researchers.</w:t>
       </w:r>
     </w:p>
     <w:p>
@@ -564,60 +656,7 @@
           <w:color w:val="1F3A5F"/>
           <w:sz w:val="22"/>
         </w:rPr>
-        <w:t>OPEN SOURCE &amp; SPEAKING</w:t>
-      </w:r>
-    </w:p>
-    <w:p>
-      <w:pPr>
-        <w:tabs>
-          <w:tab w:pos="259" w:val="left"/>
-        </w:tabs>
-        <w:spacing w:before="0" w:after="20"/>
-        <w:ind w:left="259" w:hanging="187"/>
-      </w:pPr>
-      <w:r>
-        <w:rPr>
-          <w:b w:val="0"/>
-          <w:i w:val="0"/>
-        </w:rPr>
-        <w:t>•</w:t>
-        <w:tab/>
-        <w:t>datascript-shortest-path, a graph library with a Fibonacci heap built on immutable data structures; contributor to the re-frame ecosystem (day8/re-frame-undo).</w:t>
-      </w:r>
-    </w:p>
-    <w:p>
-      <w:pPr>
-        <w:tabs>
-          <w:tab w:pos="259" w:val="left"/>
-        </w:tabs>
-        <w:spacing w:before="0" w:after="20"/>
-        <w:ind w:left="259" w:hanging="187"/>
-      </w:pPr>
-      <w:r>
-        <w:rPr>
-          <w:b w:val="0"/>
-          <w:i w:val="0"/>
-        </w:rPr>
-        <w:t>•</w:t>
-        <w:tab/>
-        <w:t>Invited speaker, "AI in the Transportation Sector: Challenges and Successes," Institute for Data, Econometrics, Algorithms, and Learning (IDEAL), Chicago, June 2024.</w:t>
-      </w:r>
-    </w:p>
-    <w:p>
-      <w:pPr>
-        <w:spacing w:before="120" w:after="40"/>
-        <w:pBdr>
-          <w:bottom w:val="single" w:sz="6" w:space="1" w:color="1F3A5F"/>
-        </w:pBdr>
-      </w:pPr>
-      <w:r>
-        <w:rPr>
-          <w:b/>
-          <w:i w:val="0"/>
-          <w:color w:val="1F3A5F"/>
-          <w:sz w:val="22"/>
-        </w:rPr>
-        <w:t>EDUCATION</w:t>
+        <w:t>EDUCATION, OPEN SOURCE &amp; SPEAKING</w:t>
       </w:r>
     </w:p>
     <w:p>
@@ -658,9 +697,28 @@
         <w:t xml:space="preserve">  |  2016</w:t>
       </w:r>
     </w:p>
+    <w:p>
+      <w:pPr>
+        <w:spacing w:before="0" w:after="30"/>
+      </w:pPr>
+      <w:r>
+        <w:rPr>
+          <w:b/>
+          <w:i w:val="0"/>
+        </w:rPr>
+        <w:t xml:space="preserve">Open source &amp; speaking: </w:t>
+      </w:r>
+      <w:r>
+        <w:rPr>
+          <w:b w:val="0"/>
+          <w:i w:val="0"/>
+        </w:rPr>
+        <w:t>author of datascript-shortest-path; contributor to day8/re-frame-undo; invited talk on AI in transportation, IDEAL institute, Chicago, 2024</w:t>
+      </w:r>
+    </w:p>
     <w:sectPr>
       <w:pgSz w:w="12240" w:h="15840"/>
-      <w:pgMar w:top="720" w:right="864" w:bottom="720" w:left="864" w:header="720" w:footer="720" w:gutter="0"/>
+      <w:pgMar w:top="648" w:right="792" w:bottom="648" w:left="792" w:header="720" w:footer="720" w:gutter="0"/>
       <w:cols w:space="720"/>
       <w:docGrid w:linePitch="360"/>
     </w:sectPr>

</xml_diff>